<commit_message>
Atualiza a cópia pública com o sistema de 30/09/2026
Traz os módulos novos (trava de custas, providência, rodada da
Controladoria com recuperação de dia perdido, jurisprudência no DJEN,
base de julgados e jurimetria estratégica) e as mudanças desde 16/09.

Mesma anonimização da primeira versão: clientes como "Cliente X",
números de processo da carteira trocados por números fictícios,
precedentes do TJRO de processos do escritório com o número omitido,
e-mails da equipe e IDs do Drive fora.

Co-Authored-By: Claude Opus 5.5 (1M context) <noreply@anthropic.com>
</commit_message>
<xml_diff>
--- a/DOCS_MODELOS/MODELO_ALONGAMENTO_DIVIDA_RURAL.docx
+++ b/DOCS_MODELOS/MODELO_ALONGAMENTO_DIVIDA_RURAL.docx
@@ -1415,49 +1415,6 @@
                 <w:sz w:val="20"/>
               </w:rPr>
               <w:t>Dos pedidos</w:t>
-            </w:r>
-          </w:p>
-        </w:tc>
-      </w:tr>
-      <w:tr>
-        <w:tc>
-          <w:tcPr>
-            <w:tcW w:type="dxa" w:w="908"/>
-            <w:shd w:val="clear" w:color="auto" w:fill="f2f2f2"/>
-          </w:tcPr>
-          <w:p>
-            <w:pPr>
-              <w:spacing w:before="40" w:after="40" w:line="276" w:lineRule="auto"/>
-              <w:jc w:val="center"/>
-            </w:pPr>
-            <w:r>
-              <w:rPr>
-                <w:rFonts w:ascii="Arial Narrow" w:hAnsi="Arial Narrow"/>
-                <w:b/>
-                <w:i w:val="0"/>
-                <w:sz w:val="20"/>
-              </w:rPr>
-              <w:t>VIII</w:t>
-            </w:r>
-          </w:p>
-        </w:tc>
-        <w:tc>
-          <w:tcPr>
-            <w:tcW w:type="dxa" w:w="8175"/>
-          </w:tcPr>
-          <w:p>
-            <w:pPr>
-              <w:spacing w:before="40" w:after="40" w:line="276" w:lineRule="auto"/>
-              <w:jc w:val="left"/>
-            </w:pPr>
-            <w:r>
-              <w:rPr>
-                <w:rFonts w:ascii="Arial Narrow" w:hAnsi="Arial Narrow"/>
-                <w:b w:val="0"/>
-                <w:i w:val="0"/>
-                <w:sz w:val="20"/>
-              </w:rPr>
-              <w:t>Do valor da causa</w:t>
             </w:r>
           </w:p>
         </w:tc>
@@ -15824,78 +15781,6 @@
     </w:p>
     <w:p>
       <w:pPr>
-        <w:spacing w:after="80" w:before="0" w:line="240" w:lineRule="auto"/>
-      </w:pPr>
-      <w:r>
-        <w:rPr>
-          <w:rFonts w:ascii="Arial Narrow" w:hAnsi="Arial Narrow"/>
-          <w:sz w:val="2"/>
-        </w:rPr>
-      </w:r>
-    </w:p>
-    <w:tbl>
-      <w:tblPr>
-        <w:tblW w:type="auto" w:w="0"/>
-        <w:jc w:val="center"/>
-        <w:tblLayout w:type="fixed"/>
-        <w:tblLook w:firstColumn="1" w:firstRow="1" w:lastColumn="0" w:lastRow="0" w:noHBand="0" w:noVBand="1" w:val="04A0"/>
-        <w:tblBorders>
-          <w:top w:val="single" w:sz="4" w:color="bfbfbf"/>
-          <w:left w:val="single" w:sz="4" w:color="bfbfbf"/>
-          <w:bottom w:val="single" w:sz="4" w:color="bfbfbf"/>
-          <w:right w:val="single" w:sz="4" w:color="bfbfbf"/>
-          <w:insideH w:val="single" w:sz="4" w:color="bfbfbf"/>
-          <w:insideV w:val="single" w:sz="4" w:color="bfbfbf"/>
-        </w:tblBorders>
-        <w:tblBorders>
-          <w:top w:val="single" w:sz="4" w:color="c55a11"/>
-          <w:left w:val="single" w:sz="4" w:color="c55a11"/>
-          <w:bottom w:val="single" w:sz="4" w:color="c55a11"/>
-          <w:right w:val="single" w:sz="4" w:color="c55a11"/>
-          <w:insideH w:val="single" w:sz="4" w:color="c55a11"/>
-          <w:insideV w:val="single" w:sz="4" w:color="c55a11"/>
-        </w:tblBorders>
-      </w:tblPr>
-      <w:tblGrid>
-        <w:gridCol w:w="9083"/>
-      </w:tblGrid>
-      <w:tr>
-        <w:tc>
-          <w:tcPr>
-            <w:tcW w:type="dxa" w:w="9083"/>
-            <w:shd w:val="clear" w:color="auto" w:fill="f6b26b"/>
-          </w:tcPr>
-          <w:p>
-            <w:pPr>
-              <w:spacing w:before="40" w:after="40" w:line="276" w:lineRule="auto"/>
-              <w:jc w:val="left"/>
-            </w:pPr>
-            <w:r>
-              <w:rPr>
-                <w:rFonts w:ascii="Arial Narrow" w:hAnsi="Arial Narrow"/>
-                <w:b/>
-                <w:i w:val="0"/>
-                <w:sz w:val="24"/>
-              </w:rPr>
-              <w:t>VIII. DO VALOR DA CAUSA</w:t>
-            </w:r>
-          </w:p>
-        </w:tc>
-      </w:tr>
-    </w:tbl>
-    <w:p>
-      <w:pPr>
-        <w:spacing w:after="80" w:before="0" w:line="240" w:lineRule="auto"/>
-      </w:pPr>
-      <w:r>
-        <w:rPr>
-          <w:rFonts w:ascii="Arial Narrow" w:hAnsi="Arial Narrow"/>
-          <w:sz w:val="2"/>
-        </w:rPr>
-      </w:r>
-    </w:p>
-    <w:p>
-      <w:pPr>
         <w:spacing w:line="360" w:lineRule="auto" w:after="120"/>
         <w:jc w:val="both"/>
       </w:pPr>
@@ -15944,26 +15829,7 @@
           <w:i w:val="0"/>
           <w:sz w:val="24"/>
         </w:rPr>
-        <w:t xml:space="preserve">), correspondente </w:t>
-      </w:r>
-      <w:r>
-        <w:rPr>
-          <w:rFonts w:ascii="Arial Narrow" w:hAnsi="Arial Narrow"/>
-          <w:b w:val="0"/>
-          <w:i w:val="0"/>
-          <w:sz w:val="24"/>
-          <w:highlight w:val="yellow"/>
-        </w:rPr>
-        <w:t>[[ao saldo das operações cuja prorrogação se pede]]</w:t>
-      </w:r>
-      <w:r>
-        <w:rPr>
-          <w:rFonts w:ascii="Arial Narrow" w:hAnsi="Arial Narrow"/>
-          <w:b w:val="0"/>
-          <w:i w:val="0"/>
-          <w:sz w:val="24"/>
-        </w:rPr>
-        <w:t>, por ser a ação relativa ao cumprimento e à modificação do ato jurídico (art. 292, II, do CPC).</w:t>
+        <w:t>).</w:t>
       </w:r>
     </w:p>
     <w:p>
@@ -15977,7 +15843,7 @@
           <w:sz w:val="20"/>
           <w:highlight w:val="yellow"/>
         </w:rPr>
-        <w:t>[PENDENTE] Não usar valor simbólico: o juiz corrige de ofício quando o valor não corresponde ao conteúdo patrimonial em discussão (art. 292, § 3º, do CPC).</w:t>
+        <w:t>[PENDENTE] Valor: [[saldo das operações cuja prorrogação se pede]] (art. 292, II, do CPC). Não usar valor simbólico: o juiz corrige de ofício (art. 292, § 3º). Manter em uma linha, sem tópico nem justificativa.</w:t>
       </w:r>
     </w:p>
     <w:p>
@@ -16149,7 +16015,7 @@
     <w:sectPr>
       <w:headerReference w:type="default" r:id="rId9"/>
       <w:pgSz w:w="11906" w:h="16838"/>
-      <w:pgMar w:top="3022" w:right="1383" w:bottom="1417" w:left="1440" w:header="720" w:footer="709" w:gutter="0"/>
+      <w:pgMar w:top="4178" w:right="1383" w:bottom="1417" w:left="1440" w:header="720" w:footer="709" w:gutter="0"/>
       <w:cols w:space="720"/>
       <w:docGrid w:linePitch="360"/>
     </w:sectPr>
@@ -16221,15 +16087,17 @@
         <w:right w:w="0" w:type="dxa"/>
       </w:tblCellMar>
       <w:tblInd w:w="-1440" w:type="dxa"/>
+      <w:tblLayout w:type="fixed"/>
     </w:tblPr>
     <w:tblGrid>
-      <w:gridCol w:w="5905"/>
-      <w:gridCol w:w="5905"/>
+      <w:gridCol w:w="5051"/>
+      <w:gridCol w:w="6758"/>
     </w:tblGrid>
     <w:tr>
       <w:tc>
         <w:tcPr>
-          <w:tcW w:type="dxa" w:w="7370"/>
+          <w:tcW w:type="dxa" w:w="5051"/>
+          <w:vAlign w:val="center"/>
         </w:tcPr>
         <w:p>
           <w:pPr>
@@ -16239,7 +16107,7 @@
           <w:r>
             <w:drawing>
               <wp:inline xmlns:a="http://schemas.openxmlformats.org/drawingml/2006/main" xmlns:pic="http://schemas.openxmlformats.org/drawingml/2006/picture">
-                <wp:extent cx="4680000" cy="1239086"/>
+                <wp:extent cx="3207600" cy="1238490"/>
                 <wp:docPr id="2" name="Picture 2"/>
                 <wp:cNvGraphicFramePr>
                   <a:graphicFrameLocks noChangeAspect="1"/>
@@ -16248,7 +16116,7 @@
                   <a:graphicData uri="http://schemas.openxmlformats.org/drawingml/2006/picture">
                     <pic:pic>
                       <pic:nvPicPr>
-                        <pic:cNvPr id="0" name="timbrado-2026-logo.png"/>
+                        <pic:cNvPr id="0" name="timbrado-2026-logo-recortada.png"/>
                         <pic:cNvPicPr/>
                       </pic:nvPicPr>
                       <pic:blipFill>
@@ -16260,7 +16128,7 @@
                       <pic:spPr>
                         <a:xfrm>
                           <a:off x="0" y="0"/>
-                          <a:ext cx="4680000" cy="1239086"/>
+                          <a:ext cx="3207600" cy="1238490"/>
                         </a:xfrm>
                         <a:prstGeom prst="rect"/>
                       </pic:spPr>
@@ -16274,166 +16142,182 @@
       </w:tc>
       <w:tc>
         <w:tcPr>
-          <w:tcW w:type="dxa" w:w="4439"/>
+          <w:tcW w:type="dxa" w:w="6758"/>
         </w:tcPr>
         <w:p>
           <w:pPr>
-            <w:spacing w:before="80" w:after="0" w:line="184" w:lineRule="exact"/>
+            <w:spacing w:before="0" w:after="0" w:line="220" w:lineRule="exact"/>
             <w:ind w:right="170"/>
             <w:jc w:val="right"/>
           </w:pPr>
           <w:r>
             <w:rPr>
-              <w:rFonts w:ascii="Arial" w:hAnsi="Arial"/>
+              <w:rFonts w:ascii="Arial" w:hAnsi="Arial" w:cs="Arial"/>
               <w:b/>
               <w:color w:val="000000"/>
-              <w:sz w:val="17"/>
+              <w:sz w:val="18"/>
             </w:rPr>
             <w:t>Renan Maldonado - OAB/RO 5.769</w:t>
           </w:r>
         </w:p>
         <w:p>
           <w:pPr>
-            <w:spacing w:before="0" w:after="0" w:line="184" w:lineRule="exact"/>
+            <w:spacing w:before="0" w:after="0" w:line="220" w:lineRule="exact"/>
             <w:ind w:right="170"/>
             <w:jc w:val="right"/>
           </w:pPr>
           <w:r>
             <w:rPr>
-              <w:rFonts w:ascii="Arial" w:hAnsi="Arial"/>
+              <w:rFonts w:ascii="Arial" w:hAnsi="Arial" w:cs="Arial"/>
               <w:b/>
               <w:color w:val="000000"/>
-              <w:sz w:val="17"/>
+              <w:sz w:val="18"/>
+            </w:rPr>
+            <w:t>Agenor Rufino - OAB/PE 62.751</w:t>
+          </w:r>
+        </w:p>
+        <w:p>
+          <w:pPr>
+            <w:spacing w:before="0" w:after="0" w:line="220" w:lineRule="exact"/>
+            <w:ind w:right="170"/>
+            <w:jc w:val="right"/>
+          </w:pPr>
+          <w:r>
+            <w:rPr>
+              <w:rFonts w:ascii="Arial" w:hAnsi="Arial" w:cs="Arial"/>
+              <w:b/>
+              <w:color w:val="000000"/>
+              <w:sz w:val="18"/>
+            </w:rPr>
+            <w:t>Ana Sheila Garcez - OAB/RO 16.126</w:t>
+          </w:r>
+        </w:p>
+        <w:p>
+          <w:pPr>
+            <w:spacing w:before="0" w:after="0" w:line="220" w:lineRule="exact"/>
+            <w:ind w:right="170"/>
+            <w:jc w:val="right"/>
+          </w:pPr>
+          <w:r>
+            <w:rPr>
+              <w:rFonts w:ascii="Arial" w:hAnsi="Arial" w:cs="Arial"/>
+              <w:b/>
+              <w:color w:val="000000"/>
+              <w:sz w:val="18"/>
+            </w:rPr>
+            <w:t>Arilson Cruz Lopes - OAB/RO 9.982</w:t>
+          </w:r>
+        </w:p>
+        <w:p>
+          <w:pPr>
+            <w:spacing w:before="0" w:after="0" w:line="220" w:lineRule="exact"/>
+            <w:ind w:right="170"/>
+            <w:jc w:val="right"/>
+          </w:pPr>
+          <w:r>
+            <w:rPr>
+              <w:rFonts w:ascii="Arial" w:hAnsi="Arial" w:cs="Arial"/>
+              <w:b/>
+              <w:color w:val="000000"/>
+              <w:sz w:val="18"/>
+            </w:rPr>
+            <w:t>Bruno Vinícius - OAB/RO 13.021</w:t>
+          </w:r>
+        </w:p>
+        <w:p>
+          <w:pPr>
+            <w:spacing w:before="0" w:after="0" w:line="220" w:lineRule="exact"/>
+            <w:ind w:right="170"/>
+            <w:jc w:val="right"/>
+          </w:pPr>
+          <w:r>
+            <w:rPr>
+              <w:rFonts w:ascii="Arial" w:hAnsi="Arial" w:cs="Arial"/>
+              <w:b/>
+              <w:color w:val="000000"/>
+              <w:sz w:val="18"/>
             </w:rPr>
             <w:t>Eliane Miranda - OAB/RO 7.904</w:t>
           </w:r>
         </w:p>
         <w:p>
           <w:pPr>
-            <w:spacing w:before="0" w:after="0" w:line="184" w:lineRule="exact"/>
+            <w:spacing w:before="0" w:after="0" w:line="220" w:lineRule="exact"/>
             <w:ind w:right="170"/>
             <w:jc w:val="right"/>
           </w:pPr>
           <w:r>
             <w:rPr>
-              <w:rFonts w:ascii="Arial" w:hAnsi="Arial"/>
+              <w:rFonts w:ascii="Arial" w:hAnsi="Arial" w:cs="Arial"/>
               <w:b/>
               <w:color w:val="000000"/>
-              <w:sz w:val="17"/>
-            </w:rPr>
-            <w:t>Arilson Cruz Lopes - OAB/RO 9.982</w:t>
-          </w:r>
-        </w:p>
-        <w:p>
-          <w:pPr>
-            <w:spacing w:before="0" w:after="0" w:line="184" w:lineRule="exact"/>
-            <w:ind w:right="170"/>
-            <w:jc w:val="right"/>
-          </w:pPr>
-          <w:r>
-            <w:rPr>
-              <w:rFonts w:ascii="Arial" w:hAnsi="Arial"/>
-              <w:b/>
-              <w:color w:val="000000"/>
-              <w:sz w:val="17"/>
-            </w:rPr>
-            <w:t>Bruno Vinícius - OAB/RO 13.021</w:t>
-          </w:r>
-        </w:p>
-        <w:p>
-          <w:pPr>
-            <w:spacing w:before="0" w:after="0" w:line="184" w:lineRule="exact"/>
-            <w:ind w:right="170"/>
-            <w:jc w:val="right"/>
-          </w:pPr>
-          <w:r>
-            <w:rPr>
-              <w:rFonts w:ascii="Arial" w:hAnsi="Arial"/>
-              <w:b/>
-              <w:color w:val="000000"/>
-              <w:sz w:val="17"/>
+              <w:sz w:val="18"/>
             </w:rPr>
             <w:t>Felipe Souza - OAB/RJ 244.309</w:t>
           </w:r>
         </w:p>
         <w:p>
           <w:pPr>
-            <w:spacing w:before="0" w:after="0" w:line="184" w:lineRule="exact"/>
+            <w:spacing w:before="0" w:after="0" w:line="220" w:lineRule="exact"/>
             <w:ind w:right="170"/>
             <w:jc w:val="right"/>
           </w:pPr>
           <w:r>
             <w:rPr>
-              <w:rFonts w:ascii="Arial" w:hAnsi="Arial"/>
+              <w:rFonts w:ascii="Arial" w:hAnsi="Arial" w:cs="Arial"/>
               <w:b/>
               <w:color w:val="000000"/>
-              <w:sz w:val="17"/>
+              <w:sz w:val="18"/>
+            </w:rPr>
+            <w:t>Heloisa Antunes - OAB/DF 76.621</w:t>
+          </w:r>
+        </w:p>
+        <w:p>
+          <w:pPr>
+            <w:spacing w:before="0" w:after="0" w:line="220" w:lineRule="exact"/>
+            <w:ind w:right="170"/>
+            <w:jc w:val="right"/>
+          </w:pPr>
+          <w:r>
+            <w:rPr>
+              <w:rFonts w:ascii="Arial" w:hAnsi="Arial" w:cs="Arial"/>
+              <w:b/>
+              <w:color w:val="000000"/>
+              <w:sz w:val="18"/>
             </w:rPr>
             <w:t>Mailson Monteiro - OAB/RO 14.501</w:t>
           </w:r>
         </w:p>
         <w:p>
           <w:pPr>
-            <w:spacing w:before="0" w:after="0" w:line="184" w:lineRule="exact"/>
+            <w:spacing w:before="0" w:after="0" w:line="220" w:lineRule="exact"/>
             <w:ind w:right="170"/>
             <w:jc w:val="right"/>
           </w:pPr>
           <w:r>
             <w:rPr>
-              <w:rFonts w:ascii="Arial" w:hAnsi="Arial"/>
+              <w:rFonts w:ascii="Arial" w:hAnsi="Arial" w:cs="Arial"/>
               <w:b/>
               <w:color w:val="000000"/>
-              <w:sz w:val="17"/>
+              <w:sz w:val="18"/>
             </w:rPr>
             <w:t>Matheus Ramos - OAB/RJ 262.255</w:t>
           </w:r>
         </w:p>
         <w:p>
           <w:pPr>
-            <w:spacing w:before="0" w:after="0" w:line="184" w:lineRule="exact"/>
+            <w:spacing w:before="0" w:after="0" w:line="220" w:lineRule="exact"/>
             <w:ind w:right="170"/>
             <w:jc w:val="right"/>
           </w:pPr>
           <w:r>
             <w:rPr>
-              <w:rFonts w:ascii="Arial" w:hAnsi="Arial"/>
+              <w:rFonts w:ascii="Arial" w:hAnsi="Arial" w:cs="Arial"/>
               <w:b/>
               <w:color w:val="000000"/>
-              <w:sz w:val="17"/>
+              <w:sz w:val="18"/>
             </w:rPr>
             <w:t>Taynara Scatolin - OAB/MT 30.109</w:t>
-          </w:r>
-        </w:p>
-        <w:p>
-          <w:pPr>
-            <w:spacing w:before="0" w:after="0" w:line="184" w:lineRule="exact"/>
-            <w:ind w:right="170"/>
-            <w:jc w:val="right"/>
-          </w:pPr>
-          <w:r>
-            <w:rPr>
-              <w:rFonts w:ascii="Arial" w:hAnsi="Arial"/>
-              <w:b/>
-              <w:color w:val="000000"/>
-              <w:sz w:val="17"/>
-            </w:rPr>
-            <w:t>Heloisa Antunes - OAB/DF 76.621</w:t>
-          </w:r>
-        </w:p>
-        <w:p>
-          <w:pPr>
-            <w:spacing w:before="0" w:after="0" w:line="184" w:lineRule="exact"/>
-            <w:ind w:right="170"/>
-            <w:jc w:val="right"/>
-          </w:pPr>
-          <w:r>
-            <w:rPr>
-              <w:rFonts w:ascii="Arial" w:hAnsi="Arial"/>
-              <w:b/>
-              <w:color w:val="000000"/>
-              <w:sz w:val="17"/>
-            </w:rPr>
-            <w:t>Agenor Rufino - OAB/PE 62.751</w:t>
           </w:r>
         </w:p>
       </w:tc>

</xml_diff>